<commit_message>
docs(report): update the report
</commit_message>
<xml_diff>
--- a/docs/26_AnhAnhHoc_IDV_REPORT.docx
+++ b/docs/26_AnhAnhHoc_IDV_REPORT.docx
@@ -579,7 +579,7 @@
           <w:lang w:val="en-US"/>
         </w:rPr>
       </w:pPr>
-      <w:bookmarkStart w:id="0" w:name="_Toc242128347"/>
+      <w:bookmarkStart w:id="0" w:name="_Toc242197374"/>
       <w:r>
         <w:rPr>
           <w:lang w:val="en-US"/>
@@ -839,7 +839,7 @@
           <w:lang w:val="en-US"/>
         </w:rPr>
       </w:pPr>
-      <w:bookmarkStart w:id="1" w:name="_Toc242128348"/>
+      <w:bookmarkStart w:id="1" w:name="_Toc242197375"/>
       <w:r>
         <w:rPr>
           <w:lang w:val="en-US"/>
@@ -962,7 +962,7 @@
           <w:lang w:val="en-US"/>
         </w:rPr>
       </w:pPr>
-      <w:bookmarkStart w:id="2" w:name="_Toc242128349"/>
+      <w:bookmarkStart w:id="2" w:name="_Toc242197376"/>
       <w:r>
         <w:rPr>
           <w:lang w:val="en-US"/>
@@ -988,7 +988,7 @@
       <w:r>
         <w:fldChar w:fldCharType="separate"/>
       </w:r>
-      <w:hyperlink w:anchor="_Toc242128347" w:history="1">
+      <w:hyperlink w:anchor="_Toc242197374" w:history="1">
         <w:r>
           <w:rPr>
             <w:rStyle w:val="Hyperlink"/>
@@ -1011,7 +1011,7 @@
           <w:rPr>
             <w:webHidden/>
           </w:rPr>
-          <w:instrText xml:space="preserve"> PAGEREF _Toc242128347 \h </w:instrText>
+          <w:instrText xml:space="preserve"> PAGEREF _Toc242197374 \h </w:instrText>
         </w:r>
         <w:r>
           <w:rPr>
@@ -1045,7 +1045,7 @@
           <w:rFonts w:eastAsiaTheme="minorEastAsia"/>
         </w:rPr>
       </w:pPr>
-      <w:hyperlink w:anchor="_Toc242128348" w:history="1">
+      <w:hyperlink w:anchor="_Toc242197375" w:history="1">
         <w:r>
           <w:rPr>
             <w:rStyle w:val="Hyperlink"/>
@@ -1068,7 +1068,7 @@
           <w:rPr>
             <w:webHidden/>
           </w:rPr>
-          <w:instrText xml:space="preserve"> PAGEREF _Toc242128348 \h </w:instrText>
+          <w:instrText xml:space="preserve"> PAGEREF _Toc242197375 \h </w:instrText>
         </w:r>
         <w:r>
           <w:rPr>
@@ -1102,7 +1102,7 @@
           <w:rFonts w:eastAsiaTheme="minorEastAsia"/>
         </w:rPr>
       </w:pPr>
-      <w:hyperlink w:anchor="_Toc242128349" w:history="1">
+      <w:hyperlink w:anchor="_Toc242197376" w:history="1">
         <w:r>
           <w:rPr>
             <w:rStyle w:val="Hyperlink"/>
@@ -1125,7 +1125,7 @@
           <w:rPr>
             <w:webHidden/>
           </w:rPr>
-          <w:instrText xml:space="preserve"> PAGEREF _Toc242128349 \h </w:instrText>
+          <w:instrText xml:space="preserve"> PAGEREF _Toc242197376 \h </w:instrText>
         </w:r>
         <w:r>
           <w:rPr>
@@ -1159,7 +1159,7 @@
           <w:rFonts w:eastAsiaTheme="minorEastAsia"/>
         </w:rPr>
       </w:pPr>
-      <w:hyperlink w:anchor="_Toc242128350" w:history="1">
+      <w:hyperlink w:anchor="_Toc242197377" w:history="1">
         <w:r>
           <w:rPr>
             <w:rStyle w:val="Hyperlink"/>
@@ -1182,7 +1182,7 @@
           <w:rPr>
             <w:webHidden/>
           </w:rPr>
-          <w:instrText xml:space="preserve"> PAGEREF _Toc242128350 \h </w:instrText>
+          <w:instrText xml:space="preserve"> PAGEREF _Toc242197377 \h </w:instrText>
         </w:r>
         <w:r>
           <w:rPr>
@@ -1216,7 +1216,7 @@
           <w:rFonts w:eastAsiaTheme="minorEastAsia"/>
         </w:rPr>
       </w:pPr>
-      <w:hyperlink w:anchor="_Toc242128351" w:history="1">
+      <w:hyperlink w:anchor="_Toc242197378" w:history="1">
         <w:r>
           <w:rPr>
             <w:rStyle w:val="Hyperlink"/>
@@ -1239,7 +1239,7 @@
           <w:rPr>
             <w:webHidden/>
           </w:rPr>
-          <w:instrText xml:space="preserve"> PAGEREF _Toc242128351 \h </w:instrText>
+          <w:instrText xml:space="preserve"> PAGEREF _Toc242197378 \h </w:instrText>
         </w:r>
         <w:r>
           <w:rPr>
@@ -1273,7 +1273,7 @@
           <w:rFonts w:eastAsiaTheme="minorEastAsia"/>
         </w:rPr>
       </w:pPr>
-      <w:hyperlink w:anchor="_Toc242128352" w:history="1">
+      <w:hyperlink w:anchor="_Toc242197379" w:history="1">
         <w:r>
           <w:rPr>
             <w:rStyle w:val="Hyperlink"/>
@@ -1296,7 +1296,7 @@
           <w:rPr>
             <w:webHidden/>
           </w:rPr>
-          <w:instrText xml:space="preserve"> PAGEREF _Toc242128352 \h </w:instrText>
+          <w:instrText xml:space="preserve"> PAGEREF _Toc242197379 \h </w:instrText>
         </w:r>
         <w:r>
           <w:rPr>
@@ -1333,7 +1333,7 @@
           <w:rFonts w:ascii="Times New Roman" w:eastAsiaTheme="minorEastAsia" w:hAnsi="Times New Roman" w:cs="Times New Roman"/>
         </w:rPr>
       </w:pPr>
-      <w:hyperlink w:anchor="_Toc242128353" w:history="1">
+      <w:hyperlink w:anchor="_Toc242197380" w:history="1">
         <w:r>
           <w:rPr>
             <w:rStyle w:val="Hyperlink"/>
@@ -1360,7 +1360,7 @@
             <w:rFonts w:ascii="Times New Roman" w:hAnsi="Times New Roman" w:cs="Times New Roman"/>
             <w:webHidden/>
           </w:rPr>
-          <w:instrText xml:space="preserve"> PAGEREF _Toc242128353 \h </w:instrText>
+          <w:instrText xml:space="preserve"> PAGEREF _Toc242197380 \h </w:instrText>
         </w:r>
         <w:r>
           <w:rPr>
@@ -1401,7 +1401,7 @@
           <w:rFonts w:ascii="Times New Roman" w:eastAsiaTheme="minorEastAsia" w:hAnsi="Times New Roman" w:cs="Times New Roman"/>
         </w:rPr>
       </w:pPr>
-      <w:hyperlink w:anchor="_Toc242128354" w:history="1">
+      <w:hyperlink w:anchor="_Toc242197381" w:history="1">
         <w:r>
           <w:rPr>
             <w:rStyle w:val="Hyperlink"/>
@@ -1428,7 +1428,7 @@
             <w:rFonts w:ascii="Times New Roman" w:hAnsi="Times New Roman" w:cs="Times New Roman"/>
             <w:webHidden/>
           </w:rPr>
-          <w:instrText xml:space="preserve"> PAGEREF _Toc242128354 \h </w:instrText>
+          <w:instrText xml:space="preserve"> PAGEREF _Toc242197381 \h </w:instrText>
         </w:r>
         <w:r>
           <w:rPr>
@@ -1469,7 +1469,7 @@
           <w:rFonts w:ascii="Times New Roman" w:eastAsiaTheme="minorEastAsia" w:hAnsi="Times New Roman" w:cs="Times New Roman"/>
         </w:rPr>
       </w:pPr>
-      <w:hyperlink w:anchor="_Toc242128355" w:history="1">
+      <w:hyperlink w:anchor="_Toc242197382" w:history="1">
         <w:r>
           <w:rPr>
             <w:rStyle w:val="Hyperlink"/>
@@ -1496,7 +1496,7 @@
             <w:rFonts w:ascii="Times New Roman" w:hAnsi="Times New Roman" w:cs="Times New Roman"/>
             <w:webHidden/>
           </w:rPr>
-          <w:instrText xml:space="preserve"> PAGEREF _Toc242128355 \h </w:instrText>
+          <w:instrText xml:space="preserve"> PAGEREF _Toc242197382 \h </w:instrText>
         </w:r>
         <w:r>
           <w:rPr>
@@ -1537,7 +1537,7 @@
           <w:rFonts w:ascii="Times New Roman" w:eastAsiaTheme="minorEastAsia" w:hAnsi="Times New Roman" w:cs="Times New Roman"/>
         </w:rPr>
       </w:pPr>
-      <w:hyperlink w:anchor="_Toc242128356" w:history="1">
+      <w:hyperlink w:anchor="_Toc242197383" w:history="1">
         <w:r>
           <w:rPr>
             <w:rStyle w:val="Hyperlink"/>
@@ -1564,7 +1564,7 @@
             <w:rFonts w:ascii="Times New Roman" w:hAnsi="Times New Roman" w:cs="Times New Roman"/>
             <w:webHidden/>
           </w:rPr>
-          <w:instrText xml:space="preserve"> PAGEREF _Toc242128356 \h </w:instrText>
+          <w:instrText xml:space="preserve"> PAGEREF _Toc242197383 \h </w:instrText>
         </w:r>
         <w:r>
           <w:rPr>
@@ -1602,7 +1602,7 @@
           <w:rFonts w:eastAsiaTheme="minorEastAsia"/>
         </w:rPr>
       </w:pPr>
-      <w:hyperlink w:anchor="_Toc242128357" w:history="1">
+      <w:hyperlink w:anchor="_Toc242197384" w:history="1">
         <w:r>
           <w:rPr>
             <w:rStyle w:val="Hyperlink"/>
@@ -1625,7 +1625,7 @@
           <w:rPr>
             <w:webHidden/>
           </w:rPr>
-          <w:instrText xml:space="preserve"> PAGEREF _Toc242128357 \h </w:instrText>
+          <w:instrText xml:space="preserve"> PAGEREF _Toc242197384 \h </w:instrText>
         </w:r>
         <w:r>
           <w:rPr>
@@ -1662,7 +1662,7 @@
           <w:rFonts w:ascii="Times New Roman" w:eastAsiaTheme="minorEastAsia" w:hAnsi="Times New Roman" w:cs="Times New Roman"/>
         </w:rPr>
       </w:pPr>
-      <w:hyperlink w:anchor="_Toc242128358" w:history="1">
+      <w:hyperlink w:anchor="_Toc242197385" w:history="1">
         <w:r>
           <w:rPr>
             <w:rStyle w:val="Hyperlink"/>
@@ -1689,7 +1689,7 @@
             <w:rFonts w:ascii="Times New Roman" w:hAnsi="Times New Roman" w:cs="Times New Roman"/>
             <w:webHidden/>
           </w:rPr>
-          <w:instrText xml:space="preserve"> PAGEREF _Toc242128358 \h </w:instrText>
+          <w:instrText xml:space="preserve"> PAGEREF _Toc242197385 \h </w:instrText>
         </w:r>
         <w:r>
           <w:rPr>
@@ -1730,7 +1730,7 @@
           <w:rFonts w:ascii="Times New Roman" w:eastAsiaTheme="minorEastAsia" w:hAnsi="Times New Roman" w:cs="Times New Roman"/>
         </w:rPr>
       </w:pPr>
-      <w:hyperlink w:anchor="_Toc242128359" w:history="1">
+      <w:hyperlink w:anchor="_Toc242197386" w:history="1">
         <w:r>
           <w:rPr>
             <w:rStyle w:val="Hyperlink"/>
@@ -1757,7 +1757,7 @@
             <w:rFonts w:ascii="Times New Roman" w:hAnsi="Times New Roman" w:cs="Times New Roman"/>
             <w:webHidden/>
           </w:rPr>
-          <w:instrText xml:space="preserve"> PAGEREF _Toc242128359 \h </w:instrText>
+          <w:instrText xml:space="preserve"> PAGEREF _Toc242197386 \h </w:instrText>
         </w:r>
         <w:r>
           <w:rPr>
@@ -1798,7 +1798,7 @@
           <w:rFonts w:ascii="Times New Roman" w:eastAsiaTheme="minorEastAsia" w:hAnsi="Times New Roman" w:cs="Times New Roman"/>
         </w:rPr>
       </w:pPr>
-      <w:hyperlink w:anchor="_Toc242128360" w:history="1">
+      <w:hyperlink w:anchor="_Toc242197387" w:history="1">
         <w:r>
           <w:rPr>
             <w:rStyle w:val="Hyperlink"/>
@@ -1825,7 +1825,7 @@
             <w:rFonts w:ascii="Times New Roman" w:hAnsi="Times New Roman" w:cs="Times New Roman"/>
             <w:webHidden/>
           </w:rPr>
-          <w:instrText xml:space="preserve"> PAGEREF _Toc242128360 \h </w:instrText>
+          <w:instrText xml:space="preserve"> PAGEREF _Toc242197387 \h </w:instrText>
         </w:r>
         <w:r>
           <w:rPr>
@@ -1866,7 +1866,7 @@
           <w:rFonts w:ascii="Times New Roman" w:eastAsiaTheme="minorEastAsia" w:hAnsi="Times New Roman" w:cs="Times New Roman"/>
         </w:rPr>
       </w:pPr>
-      <w:hyperlink w:anchor="_Toc242128361" w:history="1">
+      <w:hyperlink w:anchor="_Toc242197388" w:history="1">
         <w:r>
           <w:rPr>
             <w:rStyle w:val="Hyperlink"/>
@@ -1893,7 +1893,7 @@
             <w:rFonts w:ascii="Times New Roman" w:hAnsi="Times New Roman" w:cs="Times New Roman"/>
             <w:webHidden/>
           </w:rPr>
-          <w:instrText xml:space="preserve"> PAGEREF _Toc242128361 \h </w:instrText>
+          <w:instrText xml:space="preserve"> PAGEREF _Toc242197388 \h </w:instrText>
         </w:r>
         <w:r>
           <w:rPr>
@@ -1934,7 +1934,7 @@
           <w:rFonts w:ascii="Times New Roman" w:eastAsiaTheme="minorEastAsia" w:hAnsi="Times New Roman" w:cs="Times New Roman"/>
         </w:rPr>
       </w:pPr>
-      <w:hyperlink w:anchor="_Toc242128362" w:history="1">
+      <w:hyperlink w:anchor="_Toc242197389" w:history="1">
         <w:r>
           <w:rPr>
             <w:rStyle w:val="Hyperlink"/>
@@ -1961,7 +1961,7 @@
             <w:rFonts w:ascii="Times New Roman" w:hAnsi="Times New Roman" w:cs="Times New Roman"/>
             <w:webHidden/>
           </w:rPr>
-          <w:instrText xml:space="preserve"> PAGEREF _Toc242128362 \h </w:instrText>
+          <w:instrText xml:space="preserve"> PAGEREF _Toc242197389 \h </w:instrText>
         </w:r>
         <w:r>
           <w:rPr>
@@ -2002,7 +2002,7 @@
           <w:rFonts w:ascii="Times New Roman" w:eastAsiaTheme="minorEastAsia" w:hAnsi="Times New Roman" w:cs="Times New Roman"/>
         </w:rPr>
       </w:pPr>
-      <w:hyperlink w:anchor="_Toc242128363" w:history="1">
+      <w:hyperlink w:anchor="_Toc242197390" w:history="1">
         <w:r>
           <w:rPr>
             <w:rStyle w:val="Hyperlink"/>
@@ -2029,7 +2029,7 @@
             <w:rFonts w:ascii="Times New Roman" w:hAnsi="Times New Roman" w:cs="Times New Roman"/>
             <w:webHidden/>
           </w:rPr>
-          <w:instrText xml:space="preserve"> PAGEREF _Toc242128363 \h </w:instrText>
+          <w:instrText xml:space="preserve"> PAGEREF _Toc242197390 \h </w:instrText>
         </w:r>
         <w:r>
           <w:rPr>
@@ -2070,7 +2070,7 @@
           <w:rFonts w:ascii="Times New Roman" w:eastAsiaTheme="minorEastAsia" w:hAnsi="Times New Roman" w:cs="Times New Roman"/>
         </w:rPr>
       </w:pPr>
-      <w:hyperlink w:anchor="_Toc242128364" w:history="1">
+      <w:hyperlink w:anchor="_Toc242197391" w:history="1">
         <w:r>
           <w:rPr>
             <w:rStyle w:val="Hyperlink"/>
@@ -2097,7 +2097,7 @@
             <w:rFonts w:ascii="Times New Roman" w:hAnsi="Times New Roman" w:cs="Times New Roman"/>
             <w:webHidden/>
           </w:rPr>
-          <w:instrText xml:space="preserve"> PAGEREF _Toc242128364 \h </w:instrText>
+          <w:instrText xml:space="preserve"> PAGEREF _Toc242197391 \h </w:instrText>
         </w:r>
         <w:r>
           <w:rPr>
@@ -2138,7 +2138,7 @@
           <w:rFonts w:ascii="Times New Roman" w:eastAsiaTheme="minorEastAsia" w:hAnsi="Times New Roman" w:cs="Times New Roman"/>
         </w:rPr>
       </w:pPr>
-      <w:hyperlink w:anchor="_Toc242128365" w:history="1">
+      <w:hyperlink w:anchor="_Toc242197392" w:history="1">
         <w:r>
           <w:rPr>
             <w:rStyle w:val="Hyperlink"/>
@@ -2165,7 +2165,7 @@
             <w:rFonts w:ascii="Times New Roman" w:hAnsi="Times New Roman" w:cs="Times New Roman"/>
             <w:webHidden/>
           </w:rPr>
-          <w:instrText xml:space="preserve"> PAGEREF _Toc242128365 \h </w:instrText>
+          <w:instrText xml:space="preserve"> PAGEREF _Toc242197392 \h </w:instrText>
         </w:r>
         <w:r>
           <w:rPr>
@@ -2206,7 +2206,7 @@
           <w:rFonts w:ascii="Times New Roman" w:eastAsiaTheme="minorEastAsia" w:hAnsi="Times New Roman" w:cs="Times New Roman"/>
         </w:rPr>
       </w:pPr>
-      <w:hyperlink w:anchor="_Toc242128366" w:history="1">
+      <w:hyperlink w:anchor="_Toc242197393" w:history="1">
         <w:r>
           <w:rPr>
             <w:rStyle w:val="Hyperlink"/>
@@ -2233,7 +2233,7 @@
             <w:rFonts w:ascii="Times New Roman" w:hAnsi="Times New Roman" w:cs="Times New Roman"/>
             <w:webHidden/>
           </w:rPr>
-          <w:instrText xml:space="preserve"> PAGEREF _Toc242128366 \h </w:instrText>
+          <w:instrText xml:space="preserve"> PAGEREF _Toc242197393 \h </w:instrText>
         </w:r>
         <w:r>
           <w:rPr>
@@ -2274,7 +2274,7 @@
           <w:rFonts w:ascii="Times New Roman" w:eastAsiaTheme="minorEastAsia" w:hAnsi="Times New Roman" w:cs="Times New Roman"/>
         </w:rPr>
       </w:pPr>
-      <w:hyperlink w:anchor="_Toc242128367" w:history="1">
+      <w:hyperlink w:anchor="_Toc242197394" w:history="1">
         <w:r>
           <w:rPr>
             <w:rStyle w:val="Hyperlink"/>
@@ -2301,7 +2301,7 @@
             <w:rFonts w:ascii="Times New Roman" w:hAnsi="Times New Roman" w:cs="Times New Roman"/>
             <w:webHidden/>
           </w:rPr>
-          <w:instrText xml:space="preserve"> PAGEREF _Toc242128367 \h </w:instrText>
+          <w:instrText xml:space="preserve"> PAGEREF _Toc242197394 \h </w:instrText>
         </w:r>
         <w:r>
           <w:rPr>
@@ -2342,7 +2342,7 @@
           <w:rFonts w:ascii="Times New Roman" w:eastAsiaTheme="minorEastAsia" w:hAnsi="Times New Roman" w:cs="Times New Roman"/>
         </w:rPr>
       </w:pPr>
-      <w:hyperlink w:anchor="_Toc242128368" w:history="1">
+      <w:hyperlink w:anchor="_Toc242197395" w:history="1">
         <w:r>
           <w:rPr>
             <w:rStyle w:val="Hyperlink"/>
@@ -2369,7 +2369,7 @@
             <w:rFonts w:ascii="Times New Roman" w:hAnsi="Times New Roman" w:cs="Times New Roman"/>
             <w:webHidden/>
           </w:rPr>
-          <w:instrText xml:space="preserve"> PAGEREF _Toc242128368 \h </w:instrText>
+          <w:instrText xml:space="preserve"> PAGEREF _Toc242197395 \h </w:instrText>
         </w:r>
         <w:r>
           <w:rPr>
@@ -2410,7 +2410,7 @@
           <w:rFonts w:ascii="Times New Roman" w:eastAsiaTheme="minorEastAsia" w:hAnsi="Times New Roman" w:cs="Times New Roman"/>
         </w:rPr>
       </w:pPr>
-      <w:hyperlink w:anchor="_Toc242128369" w:history="1">
+      <w:hyperlink w:anchor="_Toc242197396" w:history="1">
         <w:r>
           <w:rPr>
             <w:rStyle w:val="Hyperlink"/>
@@ -2437,7 +2437,7 @@
             <w:rFonts w:ascii="Times New Roman" w:hAnsi="Times New Roman" w:cs="Times New Roman"/>
             <w:webHidden/>
           </w:rPr>
-          <w:instrText xml:space="preserve"> PAGEREF _Toc242128369 \h </w:instrText>
+          <w:instrText xml:space="preserve"> PAGEREF _Toc242197396 \h </w:instrText>
         </w:r>
         <w:r>
           <w:rPr>
@@ -2478,7 +2478,7 @@
           <w:rFonts w:ascii="Times New Roman" w:eastAsiaTheme="minorEastAsia" w:hAnsi="Times New Roman" w:cs="Times New Roman"/>
         </w:rPr>
       </w:pPr>
-      <w:hyperlink w:anchor="_Toc242128370" w:history="1">
+      <w:hyperlink w:anchor="_Toc242197397" w:history="1">
         <w:r>
           <w:rPr>
             <w:rStyle w:val="Hyperlink"/>
@@ -2505,7 +2505,7 @@
             <w:rFonts w:ascii="Times New Roman" w:hAnsi="Times New Roman" w:cs="Times New Roman"/>
             <w:webHidden/>
           </w:rPr>
-          <w:instrText xml:space="preserve"> PAGEREF _Toc242128370 \h </w:instrText>
+          <w:instrText xml:space="preserve"> PAGEREF _Toc242197397 \h </w:instrText>
         </w:r>
         <w:r>
           <w:rPr>
@@ -2546,7 +2546,7 @@
           <w:rFonts w:ascii="Times New Roman" w:eastAsiaTheme="minorEastAsia" w:hAnsi="Times New Roman" w:cs="Times New Roman"/>
         </w:rPr>
       </w:pPr>
-      <w:hyperlink w:anchor="_Toc242128371" w:history="1">
+      <w:hyperlink w:anchor="_Toc242197398" w:history="1">
         <w:r>
           <w:rPr>
             <w:rStyle w:val="Hyperlink"/>
@@ -2573,7 +2573,7 @@
             <w:rFonts w:ascii="Times New Roman" w:hAnsi="Times New Roman" w:cs="Times New Roman"/>
             <w:webHidden/>
           </w:rPr>
-          <w:instrText xml:space="preserve"> PAGEREF _Toc242128371 \h </w:instrText>
+          <w:instrText xml:space="preserve"> PAGEREF _Toc242197398 \h </w:instrText>
         </w:r>
         <w:r>
           <w:rPr>
@@ -2614,7 +2614,7 @@
           <w:rFonts w:ascii="Times New Roman" w:eastAsiaTheme="minorEastAsia" w:hAnsi="Times New Roman" w:cs="Times New Roman"/>
         </w:rPr>
       </w:pPr>
-      <w:hyperlink w:anchor="_Toc242128372" w:history="1">
+      <w:hyperlink w:anchor="_Toc242197399" w:history="1">
         <w:r>
           <w:rPr>
             <w:rStyle w:val="Hyperlink"/>
@@ -2641,7 +2641,7 @@
             <w:rFonts w:ascii="Times New Roman" w:hAnsi="Times New Roman" w:cs="Times New Roman"/>
             <w:webHidden/>
           </w:rPr>
-          <w:instrText xml:space="preserve"> PAGEREF _Toc242128372 \h </w:instrText>
+          <w:instrText xml:space="preserve"> PAGEREF _Toc242197399 \h </w:instrText>
         </w:r>
         <w:r>
           <w:rPr>
@@ -2682,7 +2682,7 @@
           <w:rFonts w:ascii="Times New Roman" w:eastAsiaTheme="minorEastAsia" w:hAnsi="Times New Roman" w:cs="Times New Roman"/>
         </w:rPr>
       </w:pPr>
-      <w:hyperlink w:anchor="_Toc242128373" w:history="1">
+      <w:hyperlink w:anchor="_Toc242197400" w:history="1">
         <w:r>
           <w:rPr>
             <w:rStyle w:val="Hyperlink"/>
@@ -2709,7 +2709,7 @@
             <w:rFonts w:ascii="Times New Roman" w:hAnsi="Times New Roman" w:cs="Times New Roman"/>
             <w:webHidden/>
           </w:rPr>
-          <w:instrText xml:space="preserve"> PAGEREF _Toc242128373 \h </w:instrText>
+          <w:instrText xml:space="preserve"> PAGEREF _Toc242197400 \h </w:instrText>
         </w:r>
         <w:r>
           <w:rPr>
@@ -2750,7 +2750,7 @@
           <w:rFonts w:ascii="Times New Roman" w:eastAsiaTheme="minorEastAsia" w:hAnsi="Times New Roman" w:cs="Times New Roman"/>
         </w:rPr>
       </w:pPr>
-      <w:hyperlink w:anchor="_Toc242128374" w:history="1">
+      <w:hyperlink w:anchor="_Toc242197401" w:history="1">
         <w:r>
           <w:rPr>
             <w:rStyle w:val="Hyperlink"/>
@@ -2777,7 +2777,7 @@
             <w:rFonts w:ascii="Times New Roman" w:hAnsi="Times New Roman" w:cs="Times New Roman"/>
             <w:webHidden/>
           </w:rPr>
-          <w:instrText xml:space="preserve"> PAGEREF _Toc242128374 \h </w:instrText>
+          <w:instrText xml:space="preserve"> PAGEREF _Toc242197401 \h </w:instrText>
         </w:r>
         <w:r>
           <w:rPr>
@@ -2818,7 +2818,7 @@
           <w:rFonts w:ascii="Times New Roman" w:eastAsiaTheme="minorEastAsia" w:hAnsi="Times New Roman" w:cs="Times New Roman"/>
         </w:rPr>
       </w:pPr>
-      <w:hyperlink w:anchor="_Toc242128375" w:history="1">
+      <w:hyperlink w:anchor="_Toc242197402" w:history="1">
         <w:r>
           <w:rPr>
             <w:rStyle w:val="Hyperlink"/>
@@ -2845,7 +2845,7 @@
             <w:rFonts w:ascii="Times New Roman" w:hAnsi="Times New Roman" w:cs="Times New Roman"/>
             <w:webHidden/>
           </w:rPr>
-          <w:instrText xml:space="preserve"> PAGEREF _Toc242128375 \h </w:instrText>
+          <w:instrText xml:space="preserve"> PAGEREF _Toc242197402 \h </w:instrText>
         </w:r>
         <w:r>
           <w:rPr>
@@ -2886,7 +2886,7 @@
           <w:rFonts w:ascii="Times New Roman" w:eastAsiaTheme="minorEastAsia" w:hAnsi="Times New Roman" w:cs="Times New Roman"/>
         </w:rPr>
       </w:pPr>
-      <w:hyperlink w:anchor="_Toc242128376" w:history="1">
+      <w:hyperlink w:anchor="_Toc242197403" w:history="1">
         <w:r>
           <w:rPr>
             <w:rStyle w:val="Hyperlink"/>
@@ -2913,7 +2913,7 @@
             <w:rFonts w:ascii="Times New Roman" w:hAnsi="Times New Roman" w:cs="Times New Roman"/>
             <w:webHidden/>
           </w:rPr>
-          <w:instrText xml:space="preserve"> PAGEREF _Toc242128376 \h </w:instrText>
+          <w:instrText xml:space="preserve"> PAGEREF _Toc242197403 \h </w:instrText>
         </w:r>
         <w:r>
           <w:rPr>
@@ -2954,7 +2954,7 @@
           <w:rFonts w:ascii="Times New Roman" w:eastAsiaTheme="minorEastAsia" w:hAnsi="Times New Roman" w:cs="Times New Roman"/>
         </w:rPr>
       </w:pPr>
-      <w:hyperlink w:anchor="_Toc242128377" w:history="1">
+      <w:hyperlink w:anchor="_Toc242197404" w:history="1">
         <w:r>
           <w:rPr>
             <w:rStyle w:val="Hyperlink"/>
@@ -2981,7 +2981,7 @@
             <w:rFonts w:ascii="Times New Roman" w:hAnsi="Times New Roman" w:cs="Times New Roman"/>
             <w:webHidden/>
           </w:rPr>
-          <w:instrText xml:space="preserve"> PAGEREF _Toc242128377 \h </w:instrText>
+          <w:instrText xml:space="preserve"> PAGEREF _Toc242197404 \h </w:instrText>
         </w:r>
         <w:r>
           <w:rPr>
@@ -3022,7 +3022,7 @@
           <w:rFonts w:ascii="Times New Roman" w:eastAsiaTheme="minorEastAsia" w:hAnsi="Times New Roman" w:cs="Times New Roman"/>
         </w:rPr>
       </w:pPr>
-      <w:hyperlink w:anchor="_Toc242128378" w:history="1">
+      <w:hyperlink w:anchor="_Toc242197405" w:history="1">
         <w:r>
           <w:rPr>
             <w:rStyle w:val="Hyperlink"/>
@@ -3049,7 +3049,7 @@
             <w:rFonts w:ascii="Times New Roman" w:hAnsi="Times New Roman" w:cs="Times New Roman"/>
             <w:webHidden/>
           </w:rPr>
-          <w:instrText xml:space="preserve"> PAGEREF _Toc242128378 \h </w:instrText>
+          <w:instrText xml:space="preserve"> PAGEREF _Toc242197405 \h </w:instrText>
         </w:r>
         <w:r>
           <w:rPr>
@@ -3090,7 +3090,7 @@
           <w:rFonts w:ascii="Times New Roman" w:eastAsiaTheme="minorEastAsia" w:hAnsi="Times New Roman" w:cs="Times New Roman"/>
         </w:rPr>
       </w:pPr>
-      <w:hyperlink w:anchor="_Toc242128379" w:history="1">
+      <w:hyperlink w:anchor="_Toc242197406" w:history="1">
         <w:r>
           <w:rPr>
             <w:rStyle w:val="Hyperlink"/>
@@ -3117,7 +3117,7 @@
             <w:rFonts w:ascii="Times New Roman" w:hAnsi="Times New Roman" w:cs="Times New Roman"/>
             <w:webHidden/>
           </w:rPr>
-          <w:instrText xml:space="preserve"> PAGEREF _Toc242128379 \h </w:instrText>
+          <w:instrText xml:space="preserve"> PAGEREF _Toc242197406 \h </w:instrText>
         </w:r>
         <w:r>
           <w:rPr>
@@ -3158,7 +3158,7 @@
           <w:rFonts w:ascii="Times New Roman" w:eastAsiaTheme="minorEastAsia" w:hAnsi="Times New Roman" w:cs="Times New Roman"/>
         </w:rPr>
       </w:pPr>
-      <w:hyperlink w:anchor="_Toc242128380" w:history="1">
+      <w:hyperlink w:anchor="_Toc242197407" w:history="1">
         <w:r>
           <w:rPr>
             <w:rStyle w:val="Hyperlink"/>
@@ -3185,7 +3185,7 @@
             <w:rFonts w:ascii="Times New Roman" w:hAnsi="Times New Roman" w:cs="Times New Roman"/>
             <w:webHidden/>
           </w:rPr>
-          <w:instrText xml:space="preserve"> PAGEREF _Toc242128380 \h </w:instrText>
+          <w:instrText xml:space="preserve"> PAGEREF _Toc242197407 \h </w:instrText>
         </w:r>
         <w:r>
           <w:rPr>
@@ -3226,7 +3226,7 @@
           <w:rFonts w:ascii="Times New Roman" w:eastAsiaTheme="minorEastAsia" w:hAnsi="Times New Roman" w:cs="Times New Roman"/>
         </w:rPr>
       </w:pPr>
-      <w:hyperlink w:anchor="_Toc242128381" w:history="1">
+      <w:hyperlink w:anchor="_Toc242197408" w:history="1">
         <w:r>
           <w:rPr>
             <w:rStyle w:val="Hyperlink"/>
@@ -3253,7 +3253,7 @@
             <w:rFonts w:ascii="Times New Roman" w:hAnsi="Times New Roman" w:cs="Times New Roman"/>
             <w:webHidden/>
           </w:rPr>
-          <w:instrText xml:space="preserve"> PAGEREF _Toc242128381 \h </w:instrText>
+          <w:instrText xml:space="preserve"> PAGEREF _Toc242197408 \h </w:instrText>
         </w:r>
         <w:r>
           <w:rPr>
@@ -3294,7 +3294,7 @@
           <w:rFonts w:ascii="Times New Roman" w:eastAsiaTheme="minorEastAsia" w:hAnsi="Times New Roman" w:cs="Times New Roman"/>
         </w:rPr>
       </w:pPr>
-      <w:hyperlink w:anchor="_Toc242128382" w:history="1">
+      <w:hyperlink w:anchor="_Toc242197409" w:history="1">
         <w:r>
           <w:rPr>
             <w:rStyle w:val="Hyperlink"/>
@@ -3321,7 +3321,7 @@
             <w:rFonts w:ascii="Times New Roman" w:hAnsi="Times New Roman" w:cs="Times New Roman"/>
             <w:webHidden/>
           </w:rPr>
-          <w:instrText xml:space="preserve"> PAGEREF _Toc242128382 \h </w:instrText>
+          <w:instrText xml:space="preserve"> PAGEREF _Toc242197409 \h </w:instrText>
         </w:r>
         <w:r>
           <w:rPr>
@@ -3362,7 +3362,7 @@
           <w:rFonts w:ascii="Times New Roman" w:eastAsiaTheme="minorEastAsia" w:hAnsi="Times New Roman" w:cs="Times New Roman"/>
         </w:rPr>
       </w:pPr>
-      <w:hyperlink w:anchor="_Toc242128383" w:history="1">
+      <w:hyperlink w:anchor="_Toc242197410" w:history="1">
         <w:r>
           <w:rPr>
             <w:rStyle w:val="Hyperlink"/>
@@ -3389,7 +3389,7 @@
             <w:rFonts w:ascii="Times New Roman" w:hAnsi="Times New Roman" w:cs="Times New Roman"/>
             <w:webHidden/>
           </w:rPr>
-          <w:instrText xml:space="preserve"> PAGEREF _Toc242128383 \h </w:instrText>
+          <w:instrText xml:space="preserve"> PAGEREF _Toc242197410 \h </w:instrText>
         </w:r>
         <w:r>
           <w:rPr>
@@ -3430,7 +3430,7 @@
           <w:rFonts w:ascii="Times New Roman" w:eastAsiaTheme="minorEastAsia" w:hAnsi="Times New Roman" w:cs="Times New Roman"/>
         </w:rPr>
       </w:pPr>
-      <w:hyperlink w:anchor="_Toc242128384" w:history="1">
+      <w:hyperlink w:anchor="_Toc242197411" w:history="1">
         <w:r>
           <w:rPr>
             <w:rStyle w:val="Hyperlink"/>
@@ -3457,7 +3457,7 @@
             <w:rFonts w:ascii="Times New Roman" w:hAnsi="Times New Roman" w:cs="Times New Roman"/>
             <w:webHidden/>
           </w:rPr>
-          <w:instrText xml:space="preserve"> PAGEREF _Toc242128384 \h </w:instrText>
+          <w:instrText xml:space="preserve"> PAGEREF _Toc242197411 \h </w:instrText>
         </w:r>
         <w:r>
           <w:rPr>
@@ -3498,7 +3498,7 @@
           <w:rFonts w:ascii="Times New Roman" w:eastAsiaTheme="minorEastAsia" w:hAnsi="Times New Roman" w:cs="Times New Roman"/>
         </w:rPr>
       </w:pPr>
-      <w:hyperlink w:anchor="_Toc242128385" w:history="1">
+      <w:hyperlink w:anchor="_Toc242197412" w:history="1">
         <w:r>
           <w:rPr>
             <w:rStyle w:val="Hyperlink"/>
@@ -3525,7 +3525,7 @@
             <w:rFonts w:ascii="Times New Roman" w:hAnsi="Times New Roman" w:cs="Times New Roman"/>
             <w:webHidden/>
           </w:rPr>
-          <w:instrText xml:space="preserve"> PAGEREF _Toc242128385 \h </w:instrText>
+          <w:instrText xml:space="preserve"> PAGEREF _Toc242197412 \h </w:instrText>
         </w:r>
         <w:r>
           <w:rPr>
@@ -3566,7 +3566,7 @@
           <w:rFonts w:ascii="Times New Roman" w:eastAsiaTheme="minorEastAsia" w:hAnsi="Times New Roman" w:cs="Times New Roman"/>
         </w:rPr>
       </w:pPr>
-      <w:hyperlink w:anchor="_Toc242128386" w:history="1">
+      <w:hyperlink w:anchor="_Toc242197413" w:history="1">
         <w:r>
           <w:rPr>
             <w:rStyle w:val="Hyperlink"/>
@@ -3593,7 +3593,7 @@
             <w:rFonts w:ascii="Times New Roman" w:hAnsi="Times New Roman" w:cs="Times New Roman"/>
             <w:webHidden/>
           </w:rPr>
-          <w:instrText xml:space="preserve"> PAGEREF _Toc242128386 \h </w:instrText>
+          <w:instrText xml:space="preserve"> PAGEREF _Toc242197413 \h </w:instrText>
         </w:r>
         <w:r>
           <w:rPr>
@@ -3634,7 +3634,7 @@
           <w:rFonts w:ascii="Times New Roman" w:eastAsiaTheme="minorEastAsia" w:hAnsi="Times New Roman" w:cs="Times New Roman"/>
         </w:rPr>
       </w:pPr>
-      <w:hyperlink w:anchor="_Toc242128387" w:history="1">
+      <w:hyperlink w:anchor="_Toc242197414" w:history="1">
         <w:r>
           <w:rPr>
             <w:rStyle w:val="Hyperlink"/>
@@ -3661,7 +3661,7 @@
             <w:rFonts w:ascii="Times New Roman" w:hAnsi="Times New Roman" w:cs="Times New Roman"/>
             <w:webHidden/>
           </w:rPr>
-          <w:instrText xml:space="preserve"> PAGEREF _Toc242128387 \h </w:instrText>
+          <w:instrText xml:space="preserve"> PAGEREF _Toc242197414 \h </w:instrText>
         </w:r>
         <w:r>
           <w:rPr>
@@ -3681,7 +3681,7 @@
             <w:rFonts w:ascii="Times New Roman" w:hAnsi="Times New Roman" w:cs="Times New Roman"/>
             <w:webHidden/>
           </w:rPr>
-          <w:t>24</w:t>
+          <w:t>23</w:t>
         </w:r>
         <w:r>
           <w:rPr>
@@ -3699,12 +3699,12 @@
           <w:rFonts w:eastAsiaTheme="minorEastAsia"/>
         </w:rPr>
       </w:pPr>
-      <w:hyperlink w:anchor="_Toc242128388" w:history="1">
+      <w:hyperlink w:anchor="_Toc242197415" w:history="1">
         <w:r>
           <w:rPr>
             <w:rStyle w:val="Hyperlink"/>
           </w:rPr>
-          <w:t>CHƯƠNG 3. PHÂN TÍCH DỮ LIỆU</w:t>
+          <w:t>CHƯƠNG 3. KHAI PHÁ DỮ LIỆU</w:t>
         </w:r>
         <w:r>
           <w:rPr>
@@ -3722,7 +3722,7 @@
           <w:rPr>
             <w:webHidden/>
           </w:rPr>
-          <w:instrText xml:space="preserve"> PAGEREF _Toc242128388 \h </w:instrText>
+          <w:instrText xml:space="preserve"> PAGEREF _Toc242197415 \h </w:instrText>
         </w:r>
         <w:r>
           <w:rPr>
@@ -3739,6 +3739,63 @@
           <w:rPr>
             <w:webHidden/>
           </w:rPr>
+          <w:t>25</w:t>
+        </w:r>
+        <w:r>
+          <w:rPr>
+            <w:webHidden/>
+          </w:rPr>
+          <w:fldChar w:fldCharType="end"/>
+        </w:r>
+      </w:hyperlink>
+    </w:p>
+    <w:p>
+      <w:pPr>
+        <w:pStyle w:val="TOC1"/>
+        <w:rPr>
+          <w:rFonts w:eastAsiaTheme="minorEastAsia"/>
+        </w:rPr>
+      </w:pPr>
+      <w:hyperlink w:anchor="_Toc242197416" w:history="1">
+        <w:r>
+          <w:rPr>
+            <w:rStyle w:val="Hyperlink"/>
+          </w:rPr>
+          <w:t>CHƯƠNG 4. XÂY DỰNG MÔ HÌNH DỰ BÁO</w:t>
+        </w:r>
+        <w:r>
+          <w:rPr>
+            <w:webHidden/>
+          </w:rPr>
+          <w:tab/>
+        </w:r>
+        <w:r>
+          <w:rPr>
+            <w:webHidden/>
+          </w:rPr>
+          <w:fldChar w:fldCharType="begin"/>
+        </w:r>
+        <w:r>
+          <w:rPr>
+            <w:webHidden/>
+          </w:rPr>
+          <w:instrText xml:space="preserve"> PAGEREF _Toc242197416 \h </w:instrText>
+        </w:r>
+        <w:r>
+          <w:rPr>
+            <w:webHidden/>
+          </w:rPr>
+        </w:r>
+        <w:r>
+          <w:rPr>
+            <w:webHidden/>
+          </w:rPr>
+          <w:fldChar w:fldCharType="separate"/>
+        </w:r>
+        <w:r>
+          <w:rPr>
+            <w:webHidden/>
+          </w:rPr>
           <w:t>26</w:t>
         </w:r>
         <w:r>
@@ -3756,12 +3813,12 @@
           <w:rFonts w:eastAsiaTheme="minorEastAsia"/>
         </w:rPr>
       </w:pPr>
-      <w:hyperlink w:anchor="_Toc242128389" w:history="1">
+      <w:hyperlink w:anchor="_Toc242197417" w:history="1">
         <w:r>
           <w:rPr>
             <w:rStyle w:val="Hyperlink"/>
           </w:rPr>
-          <w:t>CHƯƠNG 4. KHAI PHÁ DỮ LIỆU</w:t>
+          <w:t>CHƯƠNG 5. XÂY DỰNG DASHBOARD</w:t>
         </w:r>
         <w:r>
           <w:rPr>
@@ -3779,7 +3836,7 @@
           <w:rPr>
             <w:webHidden/>
           </w:rPr>
-          <w:instrText xml:space="preserve"> PAGEREF _Toc242128389 \h </w:instrText>
+          <w:instrText xml:space="preserve"> PAGEREF _Toc242197417 \h </w:instrText>
         </w:r>
         <w:r>
           <w:rPr>
@@ -3813,12 +3870,12 @@
           <w:rFonts w:eastAsiaTheme="minorEastAsia"/>
         </w:rPr>
       </w:pPr>
-      <w:hyperlink w:anchor="_Toc242128390" w:history="1">
+      <w:hyperlink w:anchor="_Toc242197418" w:history="1">
         <w:r>
           <w:rPr>
             <w:rStyle w:val="Hyperlink"/>
           </w:rPr>
-          <w:t>CHƯƠNG 5. XÂY DỰNG MÔ HÌNH DỰ BÁO</w:t>
+          <w:t>KẾT LUẬN</w:t>
         </w:r>
         <w:r>
           <w:rPr>
@@ -3836,7 +3893,7 @@
           <w:rPr>
             <w:webHidden/>
           </w:rPr>
-          <w:instrText xml:space="preserve"> PAGEREF _Toc242128390 \h </w:instrText>
+          <w:instrText xml:space="preserve"> PAGEREF _Toc242197418 \h </w:instrText>
         </w:r>
         <w:r>
           <w:rPr>
@@ -3870,12 +3927,12 @@
           <w:rFonts w:eastAsiaTheme="minorEastAsia"/>
         </w:rPr>
       </w:pPr>
-      <w:hyperlink w:anchor="_Toc242128391" w:history="1">
+      <w:hyperlink w:anchor="_Toc242197419" w:history="1">
         <w:r>
           <w:rPr>
             <w:rStyle w:val="Hyperlink"/>
           </w:rPr>
-          <w:t>CHƯƠNG 6. XÂY DỰNG DASHBOARD</w:t>
+          <w:t>TÀI LIỆU THAM KHẢO</w:t>
         </w:r>
         <w:r>
           <w:rPr>
@@ -3893,7 +3950,7 @@
           <w:rPr>
             <w:webHidden/>
           </w:rPr>
-          <w:instrText xml:space="preserve"> PAGEREF _Toc242128391 \h </w:instrText>
+          <w:instrText xml:space="preserve"> PAGEREF _Toc242197419 \h </w:instrText>
         </w:r>
         <w:r>
           <w:rPr>
@@ -3911,120 +3968,6 @@
             <w:webHidden/>
           </w:rPr>
           <w:t>29</w:t>
-        </w:r>
-        <w:r>
-          <w:rPr>
-            <w:webHidden/>
-          </w:rPr>
-          <w:fldChar w:fldCharType="end"/>
-        </w:r>
-      </w:hyperlink>
-    </w:p>
-    <w:p>
-      <w:pPr>
-        <w:pStyle w:val="TOC1"/>
-        <w:rPr>
-          <w:rFonts w:eastAsiaTheme="minorEastAsia"/>
-        </w:rPr>
-      </w:pPr>
-      <w:hyperlink w:anchor="_Toc242128392" w:history="1">
-        <w:r>
-          <w:rPr>
-            <w:rStyle w:val="Hyperlink"/>
-          </w:rPr>
-          <w:t>KẾT LUẬN</w:t>
-        </w:r>
-        <w:r>
-          <w:rPr>
-            <w:webHidden/>
-          </w:rPr>
-          <w:tab/>
-        </w:r>
-        <w:r>
-          <w:rPr>
-            <w:webHidden/>
-          </w:rPr>
-          <w:fldChar w:fldCharType="begin"/>
-        </w:r>
-        <w:r>
-          <w:rPr>
-            <w:webHidden/>
-          </w:rPr>
-          <w:instrText xml:space="preserve"> PAGEREF _Toc242128392 \h </w:instrText>
-        </w:r>
-        <w:r>
-          <w:rPr>
-            <w:webHidden/>
-          </w:rPr>
-        </w:r>
-        <w:r>
-          <w:rPr>
-            <w:webHidden/>
-          </w:rPr>
-          <w:fldChar w:fldCharType="separate"/>
-        </w:r>
-        <w:r>
-          <w:rPr>
-            <w:webHidden/>
-          </w:rPr>
-          <w:t>30</w:t>
-        </w:r>
-        <w:r>
-          <w:rPr>
-            <w:webHidden/>
-          </w:rPr>
-          <w:fldChar w:fldCharType="end"/>
-        </w:r>
-      </w:hyperlink>
-    </w:p>
-    <w:p>
-      <w:pPr>
-        <w:pStyle w:val="TOC1"/>
-        <w:rPr>
-          <w:rFonts w:eastAsiaTheme="minorEastAsia"/>
-        </w:rPr>
-      </w:pPr>
-      <w:hyperlink w:anchor="_Toc242128393" w:history="1">
-        <w:r>
-          <w:rPr>
-            <w:rStyle w:val="Hyperlink"/>
-          </w:rPr>
-          <w:t>TÀI LIỆU THAM KHẢO</w:t>
-        </w:r>
-        <w:r>
-          <w:rPr>
-            <w:webHidden/>
-          </w:rPr>
-          <w:tab/>
-        </w:r>
-        <w:r>
-          <w:rPr>
-            <w:webHidden/>
-          </w:rPr>
-          <w:fldChar w:fldCharType="begin"/>
-        </w:r>
-        <w:r>
-          <w:rPr>
-            <w:webHidden/>
-          </w:rPr>
-          <w:instrText xml:space="preserve"> PAGEREF _Toc242128393 \h </w:instrText>
-        </w:r>
-        <w:r>
-          <w:rPr>
-            <w:webHidden/>
-          </w:rPr>
-        </w:r>
-        <w:r>
-          <w:rPr>
-            <w:webHidden/>
-          </w:rPr>
-          <w:fldChar w:fldCharType="separate"/>
-        </w:r>
-        <w:r>
-          <w:rPr>
-            <w:webHidden/>
-          </w:rPr>
-          <w:t>31</w:t>
         </w:r>
         <w:r>
           <w:rPr>
@@ -4064,7 +4007,7 @@
           <w:lang w:val="en-US"/>
         </w:rPr>
       </w:pPr>
-      <w:bookmarkStart w:id="3" w:name="_Toc242128350"/>
+      <w:bookmarkStart w:id="3" w:name="_Toc242197377"/>
       <w:r>
         <w:rPr>
           <w:lang w:val="en-US"/>
@@ -4820,7 +4763,7 @@
             <w:rFonts w:ascii="Times New Roman" w:hAnsi="Times New Roman" w:cs="Times New Roman"/>
             <w:webHidden/>
           </w:rPr>
-          <w:t>23</w:t>
+          <w:t>22</w:t>
         </w:r>
         <w:r>
           <w:rPr>
@@ -4858,7 +4801,7 @@
           <w:lang w:val="en-US"/>
         </w:rPr>
       </w:pPr>
-      <w:bookmarkStart w:id="4" w:name="_Toc242128351"/>
+      <w:bookmarkStart w:id="4" w:name="_Toc242197378"/>
       <w:r>
         <w:rPr>
           <w:lang w:val="en-US"/>
@@ -5215,7 +5158,7 @@
             <w:rFonts w:ascii="Times New Roman" w:hAnsi="Times New Roman" w:cs="Times New Roman"/>
             <w:webHidden/>
           </w:rPr>
-          <w:t>24</w:t>
+          <w:t>23</w:t>
         </w:r>
         <w:r>
           <w:rPr>
@@ -5243,7 +5186,7 @@
       <w:pPr>
         <w:pStyle w:val="Heading1"/>
       </w:pPr>
-      <w:bookmarkStart w:id="5" w:name="_Toc242128352"/>
+      <w:bookmarkStart w:id="5" w:name="_Toc242197379"/>
       <w:r>
         <w:rPr>
           <w:lang w:val="en-US"/>
@@ -5256,8 +5199,11 @@
     <w:p>
       <w:pPr>
         <w:pStyle w:val="Heading2"/>
-      </w:pPr>
-      <w:bookmarkStart w:id="6" w:name="_Toc242128353"/>
+        <w:rPr>
+          <w:lang w:val="en-US"/>
+        </w:rPr>
+      </w:pPr>
+      <w:bookmarkStart w:id="6" w:name="_Toc242197380"/>
       <w:r>
         <w:t>Lý do chọn đề tài</w:t>
       </w:r>
@@ -5265,9 +5211,17 @@
     </w:p>
     <w:p>
       <w:pPr>
+        <w:pStyle w:val="Nidung"/>
+      </w:pPr>
+    </w:p>
+    <w:p>
+      <w:pPr>
         <w:pStyle w:val="Heading2"/>
-      </w:pPr>
-      <w:bookmarkStart w:id="7" w:name="_Toc242128354"/>
+        <w:rPr>
+          <w:lang w:val="en-US"/>
+        </w:rPr>
+      </w:pPr>
+      <w:bookmarkStart w:id="7" w:name="_Toc242197381"/>
       <w:r>
         <w:t>Mục tiêu đề tài</w:t>
       </w:r>
@@ -5275,9 +5229,17 @@
     </w:p>
     <w:p>
       <w:pPr>
+        <w:pStyle w:val="Nidung"/>
+      </w:pPr>
+    </w:p>
+    <w:p>
+      <w:pPr>
         <w:pStyle w:val="Heading2"/>
-      </w:pPr>
-      <w:bookmarkStart w:id="8" w:name="_Toc242128355"/>
+        <w:rPr>
+          <w:lang w:val="en-US"/>
+        </w:rPr>
+      </w:pPr>
+      <w:bookmarkStart w:id="8" w:name="_Toc242197382"/>
       <w:r>
         <w:t>Đối tượng và phạm vi nghiên cứu</w:t>
       </w:r>
@@ -5285,13 +5247,26 @@
     </w:p>
     <w:p>
       <w:pPr>
+        <w:pStyle w:val="Nidung"/>
+      </w:pPr>
+    </w:p>
+    <w:p>
+      <w:pPr>
         <w:pStyle w:val="Heading2"/>
-      </w:pPr>
-      <w:bookmarkStart w:id="9" w:name="_Toc242128356"/>
+        <w:rPr>
+          <w:lang w:val="en-US"/>
+        </w:rPr>
+      </w:pPr>
+      <w:bookmarkStart w:id="9" w:name="_Toc242197383"/>
       <w:r>
         <w:t>Câu hỏi nghiên cứu</w:t>
       </w:r>
       <w:bookmarkEnd w:id="9"/>
+    </w:p>
+    <w:p>
+      <w:pPr>
+        <w:pStyle w:val="Nidung"/>
+      </w:pPr>
     </w:p>
     <w:p/>
     <w:p/>
@@ -5314,7 +5289,7 @@
           <w:lang w:val="en-US"/>
         </w:rPr>
       </w:pPr>
-      <w:bookmarkStart w:id="10" w:name="_Toc242128357"/>
+      <w:bookmarkStart w:id="10" w:name="_Toc242197384"/>
       <w:r>
         <w:rPr>
           <w:lang w:val="en-US"/>
@@ -5361,7 +5336,7 @@
           <w:lang w:val="en-US"/>
         </w:rPr>
       </w:pPr>
-      <w:bookmarkStart w:id="11" w:name="_Toc242128358"/>
+      <w:bookmarkStart w:id="11" w:name="_Toc242197385"/>
       <w:r>
         <w:rPr>
           <w:lang w:val="en-US"/>
@@ -5377,7 +5352,7 @@
           <w:lang w:val="en-US"/>
         </w:rPr>
       </w:pPr>
-      <w:bookmarkStart w:id="12" w:name="_Toc242128359"/>
+      <w:bookmarkStart w:id="12" w:name="_Toc242197386"/>
       <w:r>
         <w:rPr>
           <w:lang w:val="en-US"/>
@@ -8019,7 +7994,7 @@
           <w:lang w:val="en-US"/>
         </w:rPr>
       </w:pPr>
-      <w:bookmarkStart w:id="14" w:name="_Toc242128360"/>
+      <w:bookmarkStart w:id="14" w:name="_Toc242197387"/>
       <w:r>
         <w:rPr>
           <w:lang w:val="en-US"/>
@@ -8076,7 +8051,7 @@
           <w:lang w:val="en-US"/>
         </w:rPr>
       </w:pPr>
-      <w:bookmarkStart w:id="15" w:name="_Toc242128361"/>
+      <w:bookmarkStart w:id="15" w:name="_Toc242197388"/>
       <w:r>
         <w:rPr>
           <w:lang w:val="en-US"/>
@@ -8092,7 +8067,7 @@
           <w:lang w:val="en-US"/>
         </w:rPr>
       </w:pPr>
-      <w:bookmarkStart w:id="16" w:name="_Toc242128362"/>
+      <w:bookmarkStart w:id="16" w:name="_Toc242197389"/>
       <w:r>
         <w:rPr>
           <w:lang w:val="en-US"/>
@@ -8458,7 +8433,7 @@
           <w:lang w:val="en-US"/>
         </w:rPr>
       </w:pPr>
-      <w:bookmarkStart w:id="19" w:name="_Toc242128363"/>
+      <w:bookmarkStart w:id="19" w:name="_Toc242197390"/>
       <w:r>
         <w:rPr>
           <w:lang w:val="en-US"/>
@@ -10528,7 +10503,7 @@
       <w:pPr>
         <w:pStyle w:val="Heading3"/>
       </w:pPr>
-      <w:bookmarkStart w:id="21" w:name="_Toc242128364"/>
+      <w:bookmarkStart w:id="21" w:name="_Toc242197391"/>
       <w:r>
         <w:rPr>
           <w:lang w:val="en-US"/>
@@ -11347,7 +11322,7 @@
           <w:lang w:val="en-US"/>
         </w:rPr>
       </w:pPr>
-      <w:bookmarkStart w:id="23" w:name="_Toc242128365"/>
+      <w:bookmarkStart w:id="23" w:name="_Toc242197392"/>
       <w:r>
         <w:rPr>
           <w:lang w:val="en-US"/>
@@ -13814,7 +13789,7 @@
           <w:lang w:val="en-US"/>
         </w:rPr>
       </w:pPr>
-      <w:bookmarkStart w:id="27" w:name="_Toc242128366"/>
+      <w:bookmarkStart w:id="27" w:name="_Toc242197393"/>
       <w:r>
         <w:rPr>
           <w:lang w:val="en-US"/>
@@ -16544,7 +16519,7 @@
           <w:lang w:val="en-US"/>
         </w:rPr>
       </w:pPr>
-      <w:bookmarkStart w:id="29" w:name="_Toc242128367"/>
+      <w:bookmarkStart w:id="29" w:name="_Toc242197394"/>
       <w:r>
         <w:rPr>
           <w:lang w:val="en-US"/>
@@ -18993,7 +18968,7 @@
       <w:pPr>
         <w:pStyle w:val="Heading2"/>
       </w:pPr>
-      <w:bookmarkStart w:id="31" w:name="_Toc242128368"/>
+      <w:bookmarkStart w:id="31" w:name="_Toc242197395"/>
       <w:r>
         <w:rPr>
           <w:lang w:val="en-US"/>
@@ -19006,7 +18981,7 @@
       <w:pPr>
         <w:pStyle w:val="Heading3"/>
       </w:pPr>
-      <w:bookmarkStart w:id="32" w:name="_Toc242128369"/>
+      <w:bookmarkStart w:id="32" w:name="_Toc242197396"/>
       <w:r>
         <w:t>Chuẩn hóa dữ liệu dạng chuỗi</w:t>
       </w:r>
@@ -20727,7 +20702,7 @@
       <w:pPr>
         <w:pStyle w:val="Heading3"/>
       </w:pPr>
-      <w:bookmarkStart w:id="33" w:name="_Toc242128370"/>
+      <w:bookmarkStart w:id="33" w:name="_Toc242197397"/>
       <w:r>
         <w:t>Chuẩn hóa date_added</w:t>
       </w:r>
@@ -22577,7 +22552,7 @@
       <w:pPr>
         <w:pStyle w:val="Heading3"/>
       </w:pPr>
-      <w:bookmarkStart w:id="34" w:name="_Toc242128371"/>
+      <w:bookmarkStart w:id="34" w:name="_Toc242197398"/>
       <w:r>
         <w:t>Chuẩn hóa release_year</w:t>
       </w:r>
@@ -23991,7 +23966,7 @@
       <w:pPr>
         <w:pStyle w:val="Heading3"/>
       </w:pPr>
-      <w:bookmarkStart w:id="35" w:name="_Toc242128372"/>
+      <w:bookmarkStart w:id="35" w:name="_Toc242197399"/>
       <w:r>
         <w:lastRenderedPageBreak/>
         <w:t>Chuẩn hóa duration</w:t>
@@ -24185,7 +24160,7 @@
       <w:pPr>
         <w:pStyle w:val="Heading3"/>
       </w:pPr>
-      <w:bookmarkStart w:id="36" w:name="_Toc242128373"/>
+      <w:bookmarkStart w:id="36" w:name="_Toc242197400"/>
       <w:r>
         <w:t>Xử lý dữ liệu thiếu</w:t>
       </w:r>
@@ -24257,7 +24232,7 @@
       <w:pPr>
         <w:pStyle w:val="Heading2"/>
       </w:pPr>
-      <w:bookmarkStart w:id="37" w:name="_Toc242128374"/>
+      <w:bookmarkStart w:id="37" w:name="_Toc242197401"/>
       <w:r>
         <w:t>CHUẨN HÓA DỮ LIỆU</w:t>
       </w:r>
@@ -24270,7 +24245,7 @@
           <w:lang w:val="en-US"/>
         </w:rPr>
       </w:pPr>
-      <w:bookmarkStart w:id="38" w:name="_Toc242128375"/>
+      <w:bookmarkStart w:id="38" w:name="_Toc242197402"/>
       <w:r>
         <w:t>Mục đích chuẩn hóa</w:t>
       </w:r>
@@ -24485,7 +24460,7 @@
       <w:pPr>
         <w:pStyle w:val="Heading3"/>
       </w:pPr>
-      <w:bookmarkStart w:id="40" w:name="_Toc242128376"/>
+      <w:bookmarkStart w:id="40" w:name="_Toc242197403"/>
       <w:r>
         <w:lastRenderedPageBreak/>
         <w:t>Mô hình dữ liệu sau chuẩn hóa</w:t>
@@ -25695,7 +25670,7 @@
       <w:pPr>
         <w:pStyle w:val="Heading2"/>
       </w:pPr>
-      <w:bookmarkStart w:id="42" w:name="_Toc242128377"/>
+      <w:bookmarkStart w:id="42" w:name="_Toc242197404"/>
       <w:r>
         <w:t>VALIDATION SAU CHUẨN HÓA</w:t>
       </w:r>
@@ -25895,7 +25870,7 @@
       <w:pPr>
         <w:pStyle w:val="Heading3"/>
       </w:pPr>
-      <w:bookmarkStart w:id="43" w:name="_Toc242128378"/>
+      <w:bookmarkStart w:id="43" w:name="_Toc242197405"/>
       <w:r>
         <w:lastRenderedPageBreak/>
         <w:t>Kiểm tra cấu trúc các bảng</w:t>
@@ -28329,7 +28304,7 @@
       <w:pPr>
         <w:pStyle w:val="Heading3"/>
       </w:pPr>
-      <w:bookmarkStart w:id="44" w:name="_Toc242128379"/>
+      <w:bookmarkStart w:id="44" w:name="_Toc242197406"/>
       <w:r>
         <w:t>Kiểm tra khóa chính</w:t>
       </w:r>
@@ -29614,7 +29589,7 @@
           <w:lang w:val="en-US"/>
         </w:rPr>
       </w:pPr>
-      <w:bookmarkStart w:id="46" w:name="_Toc242128380"/>
+      <w:bookmarkStart w:id="46" w:name="_Toc242197407"/>
       <w:r>
         <w:t>Kiểm tra khóa ngoại</w:t>
       </w:r>
@@ -30637,33 +30612,7 @@
           <w:szCs w:val="21"/>
           <w14:ligatures w14:val="none"/>
         </w:rPr>
-        <w:t xml:space="preserve"> </w:t>
-      </w:r>
-      <w:proofErr w:type="spellStart"/>
-      <w:r>
-        <w:rPr>
-          <w:rFonts w:ascii="Consolas" w:eastAsia="Times New Roman" w:hAnsi="Consolas" w:cs="Times New Roman"/>
-          <w:noProof w:val="0"/>
-          <w:color w:val="A31515"/>
-          <w:kern w:val="0"/>
-          <w:sz w:val="21"/>
-          <w:szCs w:val="21"/>
-          <w14:ligatures w14:val="none"/>
-        </w:rPr>
-        <w:t>tại</w:t>
-      </w:r>
-      <w:proofErr w:type="spellEnd"/>
-      <w:r>
-        <w:rPr>
-          <w:rFonts w:ascii="Consolas" w:eastAsia="Times New Roman" w:hAnsi="Consolas" w:cs="Times New Roman"/>
-          <w:noProof w:val="0"/>
-          <w:color w:val="A31515"/>
-          <w:kern w:val="0"/>
-          <w:sz w:val="21"/>
-          <w:szCs w:val="21"/>
-          <w14:ligatures w14:val="none"/>
-        </w:rPr>
-        <w:t>"</w:t>
+        <w:t xml:space="preserve"> tại"</w:t>
       </w:r>
     </w:p>
     <w:p>
@@ -30714,7 +30663,7 @@
           <w:lang w:val="en-US"/>
         </w:rPr>
       </w:pPr>
-      <w:bookmarkStart w:id="47" w:name="_Toc242128381"/>
+      <w:bookmarkStart w:id="47" w:name="_Toc242197408"/>
       <w:r>
         <w:t>Kiểm tra số lượng ngày</w:t>
       </w:r>
@@ -32808,7 +32757,7 @@
           <w:lang w:val="en-US"/>
         </w:rPr>
       </w:pPr>
-      <w:bookmarkStart w:id="48" w:name="_Toc242128382"/>
+      <w:bookmarkStart w:id="48" w:name="_Toc242197409"/>
       <w:r>
         <w:t>Kiểm tra giá trị monthly_additions</w:t>
       </w:r>
@@ -33373,33 +33322,7 @@
           <w:szCs w:val="21"/>
           <w14:ligatures w14:val="none"/>
         </w:rPr>
-        <w:t xml:space="preserve"> </w:t>
-      </w:r>
-      <w:proofErr w:type="spellStart"/>
-      <w:r>
-        <w:rPr>
-          <w:rFonts w:ascii="Consolas" w:eastAsia="Times New Roman" w:hAnsi="Consolas" w:cs="Times New Roman"/>
-          <w:noProof w:val="0"/>
-          <w:color w:val="A31515"/>
-          <w:kern w:val="0"/>
-          <w:sz w:val="21"/>
-          <w:szCs w:val="21"/>
-          <w14:ligatures w14:val="none"/>
-        </w:rPr>
-        <w:t>giá</w:t>
-      </w:r>
-      <w:proofErr w:type="spellEnd"/>
-      <w:r>
-        <w:rPr>
-          <w:rFonts w:ascii="Consolas" w:eastAsia="Times New Roman" w:hAnsi="Consolas" w:cs="Times New Roman"/>
-          <w:noProof w:val="0"/>
-          <w:color w:val="A31515"/>
-          <w:kern w:val="0"/>
-          <w:sz w:val="21"/>
-          <w:szCs w:val="21"/>
-          <w14:ligatures w14:val="none"/>
-        </w:rPr>
-        <w:t xml:space="preserve"> </w:t>
+        <w:t xml:space="preserve"> giá </w:t>
       </w:r>
       <w:proofErr w:type="spellStart"/>
       <w:r>
@@ -34205,7 +34128,7 @@
       <w:pPr>
         <w:pStyle w:val="Heading3"/>
       </w:pPr>
-      <w:bookmarkStart w:id="49" w:name="_Toc242128383"/>
+      <w:bookmarkStart w:id="49" w:name="_Toc242197410"/>
       <w:r>
         <w:t>Kiểm tra tổng số lượng title</w:t>
       </w:r>
@@ -34853,33 +34776,7 @@
           <w:szCs w:val="21"/>
           <w14:ligatures w14:val="none"/>
         </w:rPr>
-        <w:t xml:space="preserve"> </w:t>
-      </w:r>
-      <w:proofErr w:type="spellStart"/>
-      <w:r>
-        <w:rPr>
-          <w:rFonts w:ascii="Consolas" w:eastAsia="Times New Roman" w:hAnsi="Consolas" w:cs="Times New Roman"/>
-          <w:noProof w:val="0"/>
-          <w:color w:val="A31515"/>
-          <w:kern w:val="0"/>
-          <w:sz w:val="21"/>
-          <w:szCs w:val="21"/>
-          <w14:ligatures w14:val="none"/>
-        </w:rPr>
-        <w:t>dòng</w:t>
-      </w:r>
-      <w:proofErr w:type="spellEnd"/>
-      <w:r>
-        <w:rPr>
-          <w:rFonts w:ascii="Consolas" w:eastAsia="Times New Roman" w:hAnsi="Consolas" w:cs="Times New Roman"/>
-          <w:noProof w:val="0"/>
-          <w:color w:val="A31515"/>
-          <w:kern w:val="0"/>
-          <w:sz w:val="21"/>
-          <w:szCs w:val="21"/>
-          <w14:ligatures w14:val="none"/>
-        </w:rPr>
-        <w:t xml:space="preserve"> </w:t>
+        <w:t xml:space="preserve"> dòng </w:t>
       </w:r>
       <w:proofErr w:type="spellStart"/>
       <w:r>
@@ -35236,7 +35133,7 @@
           <w:lang w:val="en-US"/>
         </w:rPr>
       </w:pPr>
-      <w:bookmarkStart w:id="50" w:name="_Toc242128384"/>
+      <w:bookmarkStart w:id="50" w:name="_Toc242197411"/>
       <w:r>
         <w:t>Kiểm tra lại phạm vi thời gian của dim_title</w:t>
       </w:r>
@@ -36555,7 +36452,7 @@
       <w:pPr>
         <w:pStyle w:val="Heading3"/>
       </w:pPr>
-      <w:bookmarkStart w:id="51" w:name="_Toc242128385"/>
+      <w:bookmarkStart w:id="51" w:name="_Toc242197412"/>
       <w:r>
         <w:t>Kết quả validation</w:t>
       </w:r>
@@ -37227,7 +37124,7 @@
       <w:pPr>
         <w:pStyle w:val="Heading2"/>
       </w:pPr>
-      <w:bookmarkStart w:id="53" w:name="_Toc242128386"/>
+      <w:bookmarkStart w:id="53" w:name="_Toc242197413"/>
       <w:r>
         <w:lastRenderedPageBreak/>
         <w:t>KẾT QUẢ SAU TIỀN XỬ LÝ</w:t>
@@ -37338,11 +37235,10 @@
         <w:jc w:val="center"/>
       </w:pPr>
       <w:r>
-        <w:lastRenderedPageBreak/>
         <w:drawing>
-          <wp:inline distT="0" distB="0" distL="0" distR="0" wp14:anchorId="42F299DA" wp14:editId="4DD1196D">
-            <wp:extent cx="4610100" cy="8010866"/>
-            <wp:effectExtent l="0" t="0" r="0" b="9525"/>
+          <wp:inline distT="0" distB="0" distL="0" distR="0" wp14:anchorId="42F299DA" wp14:editId="43FED408">
+            <wp:extent cx="4505608" cy="6359769"/>
+            <wp:effectExtent l="0" t="0" r="9525" b="3175"/>
             <wp:docPr id="1962791457" name="Picture 2"/>
             <wp:cNvGraphicFramePr>
               <a:graphicFrameLocks xmlns:a="http://schemas.openxmlformats.org/drawingml/2006/main" noChangeAspect="1"/>
@@ -37372,7 +37268,7 @@
                   <pic:spPr bwMode="auto">
                     <a:xfrm>
                       <a:off x="0" y="0"/>
-                      <a:ext cx="4618997" cy="8026326"/>
+                      <a:ext cx="4527249" cy="6390316"/>
                     </a:xfrm>
                     <a:prstGeom prst="rect">
                       <a:avLst/>
@@ -37443,6 +37339,7 @@
         <w:pStyle w:val="Nidung"/>
       </w:pPr>
       <w:r>
+        <w:lastRenderedPageBreak/>
         <w:t>Và</w:t>
       </w:r>
       <w:r>
@@ -37462,7 +37359,6 @@
       </w:pPr>
       <w:bookmarkStart w:id="55" w:name="_Toc242128398"/>
       <w:r>
-        <w:lastRenderedPageBreak/>
         <w:t xml:space="preserve">Bảng </w:t>
       </w:r>
       <w:r>
@@ -37901,7 +37797,7 @@
       <w:pPr>
         <w:pStyle w:val="Heading2"/>
       </w:pPr>
-      <w:bookmarkStart w:id="56" w:name="_Toc242128387"/>
+      <w:bookmarkStart w:id="56" w:name="_Toc242197414"/>
       <w:r>
         <w:t>KẾT LUẬN CHƯƠNG</w:t>
       </w:r>
@@ -38012,41 +37908,11 @@
     <w:p>
       <w:pPr>
         <w:pStyle w:val="Heading1"/>
-      </w:pPr>
-      <w:bookmarkStart w:id="57" w:name="_Toc242128388"/>
-      <w:r>
         <w:rPr>
           <w:lang w:val="en-US"/>
         </w:rPr>
-        <w:lastRenderedPageBreak/>
-        <w:t>PHÂN TÍCH DỮ LIỆU</w:t>
-      </w:r>
-      <w:bookmarkEnd w:id="57"/>
-    </w:p>
-    <w:p>
-      <w:pPr>
-        <w:pStyle w:val="Nidung"/>
-        <w:rPr>
-          <w:lang w:val="vi-VN"/>
-        </w:rPr>
-      </w:pPr>
-    </w:p>
-    <w:p>
-      <w:pPr>
-        <w:pStyle w:val="Nidung"/>
-      </w:pPr>
-      <w:r>
-        <w:br w:type="page"/>
-      </w:r>
-    </w:p>
-    <w:p>
-      <w:pPr>
-        <w:pStyle w:val="Heading1"/>
-        <w:rPr>
-          <w:lang w:val="en-US"/>
-        </w:rPr>
-      </w:pPr>
-      <w:bookmarkStart w:id="58" w:name="_Toc242128389"/>
+      </w:pPr>
+      <w:bookmarkStart w:id="57" w:name="_Toc242197415"/>
       <w:r>
         <w:rPr>
           <w:lang w:val="en-US"/>
@@ -38054,7 +37920,7 @@
         <w:lastRenderedPageBreak/>
         <w:t>KHAI PHÁ DỮ LIỆU</w:t>
       </w:r>
-      <w:bookmarkEnd w:id="58"/>
+      <w:bookmarkEnd w:id="57"/>
     </w:p>
     <w:p/>
     <w:p>
@@ -38069,7 +37935,7 @@
           <w:lang w:val="en-US"/>
         </w:rPr>
       </w:pPr>
-      <w:bookmarkStart w:id="59" w:name="_Toc242128390"/>
+      <w:bookmarkStart w:id="58" w:name="_Toc242197416"/>
       <w:r>
         <w:rPr>
           <w:lang w:val="en-US"/>
@@ -38077,7 +37943,7 @@
         <w:lastRenderedPageBreak/>
         <w:t>XÂY DỰNG MÔ HÌNH DỰ BÁO</w:t>
       </w:r>
-      <w:bookmarkEnd w:id="59"/>
+      <w:bookmarkEnd w:id="58"/>
     </w:p>
     <w:p/>
     <w:p>
@@ -38092,7 +37958,7 @@
           <w:lang w:val="en-US"/>
         </w:rPr>
       </w:pPr>
-      <w:bookmarkStart w:id="60" w:name="_Toc242128391"/>
+      <w:bookmarkStart w:id="59" w:name="_Toc242197417"/>
       <w:r>
         <w:rPr>
           <w:lang w:val="en-US"/>
@@ -38100,7 +37966,7 @@
         <w:lastRenderedPageBreak/>
         <w:t>XÂY DỰNG DASHBOARD</w:t>
       </w:r>
-      <w:bookmarkEnd w:id="60"/>
+      <w:bookmarkEnd w:id="59"/>
     </w:p>
     <w:p/>
     <w:p>
@@ -38120,7 +37986,7 @@
           <w:lang w:val="en-US"/>
         </w:rPr>
       </w:pPr>
-      <w:bookmarkStart w:id="61" w:name="_Toc242128392"/>
+      <w:bookmarkStart w:id="60" w:name="_Toc242197418"/>
       <w:r>
         <w:rPr>
           <w:lang w:val="en-US"/>
@@ -38128,7 +37994,7 @@
         <w:lastRenderedPageBreak/>
         <w:t>KẾT LUẬN</w:t>
       </w:r>
-      <w:bookmarkEnd w:id="61"/>
+      <w:bookmarkEnd w:id="60"/>
     </w:p>
     <w:p/>
     <w:p>
@@ -38151,7 +38017,7 @@
           <w:lang w:val="en-US"/>
         </w:rPr>
       </w:pPr>
-      <w:bookmarkStart w:id="62" w:name="_Toc242128393"/>
+      <w:bookmarkStart w:id="61" w:name="_Toc242197419"/>
       <w:r>
         <w:rPr>
           <w:lang w:val="en-US"/>
@@ -38159,7 +38025,7 @@
         <w:lastRenderedPageBreak/>
         <w:t>TÀI LIỆU THAM KHẢO</w:t>
       </w:r>
-      <w:bookmarkEnd w:id="62"/>
+      <w:bookmarkEnd w:id="61"/>
     </w:p>
     <w:p>
       <w:pPr>

</xml_diff>